<commit_message>
Polish reports and references
</commit_message>
<xml_diff>
--- a/partA/report.docx
+++ b/partA/report.docx
@@ -38,7 +38,7 @@
         <w:t xml:space="preserve">2026-05-14</w:t>
       </w:r>
     </w:p>
-    <w:bookmarkStart w:id="60" w:name="part-a-unix-io-基础性能对比实验报告"/>
+    <w:bookmarkStart w:id="61" w:name="part-a-unix-io-基础性能对比实验报告"/>
     <w:p>
       <w:pPr>
         <w:pStyle w:val="Heading1"/>
@@ -575,7 +575,7 @@
       </w:r>
     </w:p>
     <w:bookmarkEnd w:id="21"/>
-    <w:bookmarkStart w:id="26" w:name="实验方法"/>
+    <w:bookmarkStart w:id="27" w:name="实验方法"/>
     <w:p>
       <w:pPr>
         <w:pStyle w:val="Heading2"/>
@@ -795,19 +795,19 @@
       </w:r>
     </w:p>
     <w:bookmarkEnd w:id="22"/>
-    <w:bookmarkStart w:id="23" w:name="缓冲区大小"/>
+    <w:bookmarkStart w:id="23" w:name="实验取舍"/>
     <w:p>
       <w:pPr>
         <w:pStyle w:val="Heading3"/>
       </w:pPr>
       <w:r>
-        <w:t xml:space="preserve">3.2 </w:t>
-      </w:r>
-      <w:r>
-        <w:rPr>
-          <w:rFonts w:hint="eastAsia"/>
-        </w:rPr>
-        <w:t xml:space="preserve">缓冲区大小</w:t>
+        <w:t xml:space="preserve">3.1.1 </w:t>
+      </w:r>
+      <w:r>
+        <w:rPr>
+          <w:rFonts w:hint="eastAsia"/>
+        </w:rPr>
+        <w:t xml:space="preserve">实验取舍</w:t>
       </w:r>
     </w:p>
     <w:p>
@@ -818,6 +818,242 @@
         <w:rPr>
           <w:rFonts w:hint="eastAsia"/>
         </w:rPr>
+        <w:t xml:space="preserve">这组实验最容易被“小</w:t>
+      </w:r>
+      <w:r>
+        <w:t xml:space="preserve"> </w:t>
+      </w:r>
+      <w:r>
+        <w:rPr>
+          <w:rFonts w:hint="eastAsia"/>
+        </w:rPr>
+        <w:t xml:space="preserve">BUFFSIZE”拖慢。以</w:t>
+      </w:r>
+      <w:r>
+        <w:t xml:space="preserve"> 500 MB </w:t>
+      </w:r>
+      <w:r>
+        <w:rPr>
+          <w:rFonts w:hint="eastAsia"/>
+        </w:rPr>
+        <w:t xml:space="preserve">文件为例，</w:t>
+      </w:r>
+      <w:r>
+        <w:rPr>
+          <w:rStyle w:val="VerbatimChar"/>
+        </w:rPr>
+        <w:t xml:space="preserve">bufsize=1</w:t>
+      </w:r>
+      <w:r>
+        <w:t xml:space="preserve"> </w:t>
+      </w:r>
+      <w:r>
+        <w:rPr>
+          <w:rFonts w:hint="eastAsia"/>
+        </w:rPr>
+        <w:t xml:space="preserve">意味着</w:t>
+      </w:r>
+      <w:r>
+        <w:t xml:space="preserve"> 5 </w:t>
+      </w:r>
+      <w:r>
+        <w:rPr>
+          <w:rFonts w:hint="eastAsia"/>
+        </w:rPr>
+        <w:t xml:space="preserve">亿多次系统调用；如果再叠加</w:t>
+      </w:r>
+      <w:r>
+        <w:t xml:space="preserve"> </w:t>
+      </w:r>
+      <w:r>
+        <w:rPr>
+          <w:rStyle w:val="VerbatimChar"/>
+        </w:rPr>
+        <w:t xml:space="preserve">O_SYNC</w:t>
+      </w:r>
+      <w:r>
+        <w:rPr>
+          <w:rFonts w:hint="eastAsia"/>
+        </w:rPr>
+        <w:t xml:space="preserve">，实验时间会从分钟级膨胀到不可接受的程度。因此读实验严格使用</w:t>
+      </w:r>
+      <w:r>
+        <w:t xml:space="preserve"> 500 MB </w:t>
+      </w:r>
+      <w:r>
+        <w:rPr>
+          <w:rFonts w:hint="eastAsia"/>
+        </w:rPr>
+        <w:t xml:space="preserve">文件，保证读取接口的比较有足够数据量；普通</w:t>
+      </w:r>
+      <w:r>
+        <w:t xml:space="preserve"> </w:t>
+      </w:r>
+      <w:r>
+        <w:rPr>
+          <w:rStyle w:val="VerbatimChar"/>
+        </w:rPr>
+        <w:t xml:space="preserve">write()</w:t>
+      </w:r>
+      <w:r>
+        <w:t xml:space="preserve"> </w:t>
+      </w:r>
+      <w:r>
+        <w:rPr>
+          <w:rFonts w:hint="eastAsia"/>
+        </w:rPr>
+        <w:t xml:space="preserve">也保留了一组</w:t>
+      </w:r>
+      <w:r>
+        <w:t xml:space="preserve"> 500 MB </w:t>
+      </w:r>
+      <w:r>
+        <w:rPr>
+          <w:rFonts w:hint="eastAsia"/>
+        </w:rPr>
+        <w:t xml:space="preserve">数据，用来观察系统调用次数下降后的整体趋势；</w:t>
+      </w:r>
+      <w:r>
+        <w:rPr>
+          <w:rStyle w:val="VerbatimChar"/>
+        </w:rPr>
+        <w:t xml:space="preserve">O_SYNC write</w:t>
+      </w:r>
+      <w:r>
+        <w:t xml:space="preserve"> </w:t>
+      </w:r>
+      <w:r>
+        <w:rPr>
+          <w:rFonts w:hint="eastAsia"/>
+        </w:rPr>
+        <w:t xml:space="preserve">则使用</w:t>
+      </w:r>
+      <w:r>
+        <w:t xml:space="preserve"> 64 KB </w:t>
+      </w:r>
+      <w:r>
+        <w:rPr>
+          <w:rFonts w:hint="eastAsia"/>
+        </w:rPr>
+        <w:t xml:space="preserve">和</w:t>
+      </w:r>
+      <w:r>
+        <w:t xml:space="preserve"> 1 MB </w:t>
+      </w:r>
+      <w:r>
+        <w:rPr>
+          <w:rFonts w:hint="eastAsia"/>
+        </w:rPr>
+        <w:t xml:space="preserve">两组较小写入量，重点比较相同</w:t>
+      </w:r>
+      <w:r>
+        <w:t xml:space="preserve"> BUFFSIZE </w:t>
+      </w:r>
+      <w:r>
+        <w:rPr>
+          <w:rFonts w:hint="eastAsia"/>
+        </w:rPr>
+        <w:t xml:space="preserve">序列下同步写语义带来的额外成本。</w:t>
+      </w:r>
+    </w:p>
+    <w:p>
+      <w:pPr>
+        <w:pStyle w:val="BodyText"/>
+      </w:pPr>
+      <w:r>
+        <w:rPr>
+          <w:rFonts w:hint="eastAsia"/>
+        </w:rPr>
+        <w:t xml:space="preserve">这个取舍不是为了回避慢结果，而是为了让实验能够完整覆盖所有</w:t>
+      </w:r>
+      <w:r>
+        <w:t xml:space="preserve"> </w:t>
+      </w:r>
+      <w:r>
+        <w:rPr>
+          <w:rFonts w:hint="eastAsia"/>
+        </w:rPr>
+        <w:t xml:space="preserve">BUFFSIZE。后面的分析也不会把</w:t>
+      </w:r>
+      <w:r>
+        <w:t xml:space="preserve"> 1 MB </w:t>
+      </w:r>
+      <w:r>
+        <w:rPr>
+          <w:rFonts w:hint="eastAsia"/>
+        </w:rPr>
+        <w:t xml:space="preserve">的</w:t>
+      </w:r>
+      <w:r>
+        <w:t xml:space="preserve"> </w:t>
+      </w:r>
+      <w:r>
+        <w:rPr>
+          <w:rStyle w:val="VerbatimChar"/>
+        </w:rPr>
+        <w:t xml:space="preserve">O_SYNC</w:t>
+      </w:r>
+      <w:r>
+        <w:t xml:space="preserve"> </w:t>
+      </w:r>
+      <w:r>
+        <w:rPr>
+          <w:rFonts w:hint="eastAsia"/>
+        </w:rPr>
+        <w:t xml:space="preserve">结果和</w:t>
+      </w:r>
+      <w:r>
+        <w:t xml:space="preserve"> 500 MB </w:t>
+      </w:r>
+      <w:r>
+        <w:rPr>
+          <w:rFonts w:hint="eastAsia"/>
+        </w:rPr>
+        <w:t xml:space="preserve">的普通</w:t>
+      </w:r>
+      <w:r>
+        <w:t xml:space="preserve"> </w:t>
+      </w:r>
+      <w:r>
+        <w:rPr>
+          <w:rStyle w:val="VerbatimChar"/>
+        </w:rPr>
+        <w:t xml:space="preserve">write</w:t>
+      </w:r>
+      <w:r>
+        <w:t xml:space="preserve"> </w:t>
+      </w:r>
+      <w:r>
+        <w:rPr>
+          <w:rFonts w:hint="eastAsia"/>
+        </w:rPr>
+        <w:t xml:space="preserve">做绝对时间比较，而是主要看同一写入量下普通写与同步写的相对差异。</w:t>
+      </w:r>
+    </w:p>
+    <w:bookmarkEnd w:id="23"/>
+    <w:bookmarkStart w:id="24" w:name="缓冲区大小"/>
+    <w:p>
+      <w:pPr>
+        <w:pStyle w:val="Heading3"/>
+      </w:pPr>
+      <w:r>
+        <w:t xml:space="preserve">3.2 </w:t>
+      </w:r>
+      <w:r>
+        <w:rPr>
+          <w:rFonts w:hint="eastAsia"/>
+        </w:rPr>
+        <w:t xml:space="preserve">缓冲区大小</w:t>
+      </w:r>
+    </w:p>
+    <w:p>
+      <w:pPr>
+        <w:pStyle w:val="FirstParagraph"/>
+      </w:pPr>
+      <w:r>
+        <w:rPr>
+          <w:rFonts w:hint="eastAsia"/>
+        </w:rPr>
         <w:t xml:space="preserve">按照实验要求，使用以下</w:t>
       </w:r>
       <w:r>
@@ -859,8 +1095,8 @@
         <w:t xml:space="preserve">65536, 16777216</w:t>
       </w:r>
     </w:p>
-    <w:bookmarkEnd w:id="23"/>
-    <w:bookmarkStart w:id="24" w:name="读实验"/>
+    <w:bookmarkEnd w:id="24"/>
+    <w:bookmarkStart w:id="25" w:name="读实验"/>
     <w:p>
       <w:pPr>
         <w:pStyle w:val="Heading3"/>
@@ -1013,8 +1249,8 @@
         <w:t xml:space="preserve">是逐字符接口，因此各测试一次。</w:t>
       </w:r>
     </w:p>
-    <w:bookmarkEnd w:id="24"/>
-    <w:bookmarkStart w:id="25" w:name="写实验"/>
+    <w:bookmarkEnd w:id="25"/>
+    <w:bookmarkStart w:id="26" w:name="写实验"/>
     <w:p>
       <w:pPr>
         <w:pStyle w:val="Heading3"/>
@@ -1309,9 +1545,9 @@
         <w:t xml:space="preserve">在相同写入总量下比较，同时避免小缓冲同步写将实验时间放大到数小时。</w:t>
       </w:r>
     </w:p>
-    <w:bookmarkEnd w:id="25"/>
     <w:bookmarkEnd w:id="26"/>
-    <w:bookmarkStart w:id="47" w:name="实验结果"/>
+    <w:bookmarkEnd w:id="27"/>
+    <w:bookmarkStart w:id="48" w:name="实验结果"/>
     <w:p>
       <w:pPr>
         <w:pStyle w:val="Heading2"/>
@@ -1326,7 +1562,7 @@
         <w:t xml:space="preserve">实验结果</w:t>
       </w:r>
     </w:p>
-    <w:bookmarkStart w:id="33" w:name="read-fread-my_fread-趋势"/>
+    <w:bookmarkStart w:id="34" w:name="read-fread-my_fread-趋势"/>
     <w:p>
       <w:pPr>
         <w:pStyle w:val="Heading3"/>
@@ -1350,18 +1586,18 @@
           <wp:inline>
             <wp:extent cx="5334000" cy="3200400"/>
             <wp:effectExtent b="0" l="0" r="0" t="0"/>
-            <wp:docPr descr="read/fread/my_fread real time" title="" id="28" name="Picture"/>
+            <wp:docPr descr="read/fread/my_fread real time" title="" id="29" name="Picture"/>
             <a:graphic>
               <a:graphicData uri="http://schemas.openxmlformats.org/drawingml/2006/picture">
                 <pic:pic>
                   <pic:nvPicPr>
-                    <pic:cNvPr descr="figures/partA_read_real_time.png" id="29" name="Picture"/>
+                    <pic:cNvPr descr="figures/partA_read_real_time.png" id="30" name="Picture"/>
                     <pic:cNvPicPr>
                       <a:picLocks noChangeArrowheads="1" noChangeAspect="1"/>
                     </pic:cNvPicPr>
                   </pic:nvPicPr>
                   <pic:blipFill>
-                    <a:blip r:embed="rId27"/>
+                    <a:blip r:embed="rId28"/>
                     <a:stretch>
                       <a:fillRect/>
                     </a:stretch>
@@ -1569,18 +1805,18 @@
           <wp:inline>
             <wp:extent cx="5334000" cy="3200400"/>
             <wp:effectExtent b="0" l="0" r="0" t="0"/>
-            <wp:docPr descr="read real/user/sys breakdown" title="" id="31" name="Picture"/>
+            <wp:docPr descr="read real/user/sys breakdown" title="" id="32" name="Picture"/>
             <a:graphic>
               <a:graphicData uri="http://schemas.openxmlformats.org/drawingml/2006/picture">
                 <pic:pic>
                   <pic:nvPicPr>
-                    <pic:cNvPr descr="figures/partA_read_time_breakdown.png" id="32" name="Picture"/>
+                    <pic:cNvPr descr="figures/partA_read_time_breakdown.png" id="33" name="Picture"/>
                     <pic:cNvPicPr>
                       <a:picLocks noChangeArrowheads="1" noChangeAspect="1"/>
                     </pic:cNvPicPr>
                   </pic:nvPicPr>
                   <pic:blipFill>
-                    <a:blip r:embed="rId30"/>
+                    <a:blip r:embed="rId31"/>
                     <a:stretch>
                       <a:fillRect/>
                     </a:stretch>
@@ -1731,8 +1967,8 @@
         <w:t xml:space="preserve">附近后，继续增大缓冲区收益有限，说明此时已经接近顺序读取和页缓存路径的稳定吞吐区间。</w:t>
       </w:r>
     </w:p>
-    <w:bookmarkEnd w:id="33"/>
-    <w:bookmarkStart w:id="37" w:name="getc-与-fgetc"/>
+    <w:bookmarkEnd w:id="34"/>
+    <w:bookmarkStart w:id="38" w:name="getc-与-fgetc"/>
     <w:p>
       <w:pPr>
         <w:pStyle w:val="Heading3"/>
@@ -1759,18 +1995,18 @@
           <wp:inline>
             <wp:extent cx="5303520" cy="4023360"/>
             <wp:effectExtent b="0" l="0" r="0" t="0"/>
-            <wp:docPr descr="getc vs fgetc" title="" id="35" name="Picture"/>
+            <wp:docPr descr="getc vs fgetc" title="" id="36" name="Picture"/>
             <a:graphic>
               <a:graphicData uri="http://schemas.openxmlformats.org/drawingml/2006/picture">
                 <pic:pic>
                   <pic:nvPicPr>
-                    <pic:cNvPr descr="figures/partA_getc_fgetc.png" id="36" name="Picture"/>
+                    <pic:cNvPr descr="figures/partA_getc_fgetc.png" id="37" name="Picture"/>
                     <pic:cNvPicPr>
                       <a:picLocks noChangeArrowheads="1" noChangeAspect="1"/>
                     </pic:cNvPicPr>
                   </pic:nvPicPr>
                   <pic:blipFill>
-                    <a:blip r:embed="rId34"/>
+                    <a:blip r:embed="rId35"/>
                     <a:stretch>
                       <a:fillRect/>
                     </a:stretch>
@@ -1980,8 +2216,8 @@
         <w:t xml:space="preserve">的状态检查和接口调用路径。</w:t>
       </w:r>
     </w:p>
-    <w:bookmarkEnd w:id="37"/>
-    <w:bookmarkStart w:id="38" w:name="fread-与-my_fread"/>
+    <w:bookmarkEnd w:id="38"/>
+    <w:bookmarkStart w:id="39" w:name="fread-与-my_fread"/>
     <w:p>
       <w:pPr>
         <w:pStyle w:val="Heading3"/>
@@ -2171,8 +2407,76 @@
         <w:t xml:space="preserve"> libc。</w:t>
       </w:r>
     </w:p>
-    <w:bookmarkEnd w:id="38"/>
-    <w:bookmarkStart w:id="42" w:name="普通-write"/>
+    <w:p>
+      <w:pPr>
+        <w:pStyle w:val="BodyText"/>
+      </w:pPr>
+      <w:r>
+        <w:rPr>
+          <w:rFonts w:hint="eastAsia"/>
+        </w:rPr>
+        <w:t xml:space="preserve">还有一个细节值得注意：</w:t>
+      </w:r>
+      <w:r>
+        <w:rPr>
+          <w:rStyle w:val="VerbatimChar"/>
+        </w:rPr>
+        <w:t xml:space="preserve">my_fread(bufsize=1)</w:t>
+      </w:r>
+      <w:r>
+        <w:t xml:space="preserve"> </w:t>
+      </w:r>
+      <w:r>
+        <w:rPr>
+          <w:rFonts w:hint="eastAsia"/>
+        </w:rPr>
+        <w:t xml:space="preserve">的表现接近逐字节</w:t>
+      </w:r>
+      <w:r>
+        <w:t xml:space="preserve"> </w:t>
+      </w:r>
+      <w:r>
+        <w:rPr>
+          <w:rStyle w:val="VerbatimChar"/>
+        </w:rPr>
+        <w:t xml:space="preserve">read()</w:t>
+      </w:r>
+      <w:r>
+        <w:rPr>
+          <w:rFonts w:hint="eastAsia"/>
+        </w:rPr>
+        <w:t xml:space="preserve">，因为外部每次只请求</w:t>
+      </w:r>
+      <w:r>
+        <w:t xml:space="preserve"> 1 </w:t>
+      </w:r>
+      <w:r>
+        <w:rPr>
+          <w:rFonts w:hint="eastAsia"/>
+        </w:rPr>
+        <w:t xml:space="preserve">字节，内部缓冲区容量也随测试</w:t>
+      </w:r>
+      <w:r>
+        <w:t xml:space="preserve"> BUFFSIZE </w:t>
+      </w:r>
+      <w:r>
+        <w:rPr>
+          <w:rFonts w:hint="eastAsia"/>
+        </w:rPr>
+        <w:t xml:space="preserve">设置为</w:t>
+      </w:r>
+      <w:r>
+        <w:t xml:space="preserve"> 1 </w:t>
+      </w:r>
+      <w:r>
+        <w:rPr>
+          <w:rFonts w:hint="eastAsia"/>
+        </w:rPr>
+        <w:t xml:space="preserve">字节，此时无法发挥“先批量读入、再在用户态分发”的优势。这说明缓冲机制本身并不是魔法，关键仍在于每次进入内核时能带回足够多的数据。</w:t>
+      </w:r>
+    </w:p>
+    <w:bookmarkEnd w:id="39"/>
+    <w:bookmarkStart w:id="43" w:name="普通-write"/>
     <w:p>
       <w:pPr>
         <w:pStyle w:val="Heading3"/>
@@ -2199,18 +2503,18 @@
           <wp:inline>
             <wp:extent cx="5334000" cy="3200400"/>
             <wp:effectExtent b="0" l="0" r="0" t="0"/>
-            <wp:docPr descr="write 500MB" title="" id="40" name="Picture"/>
+            <wp:docPr descr="write 500MB" title="" id="41" name="Picture"/>
             <a:graphic>
               <a:graphicData uri="http://schemas.openxmlformats.org/drawingml/2006/picture">
                 <pic:pic>
                   <pic:nvPicPr>
-                    <pic:cNvPr descr="figures/partA_write_500MB.png" id="41" name="Picture"/>
+                    <pic:cNvPr descr="figures/partA_write_500MB.png" id="42" name="Picture"/>
                     <pic:cNvPicPr>
                       <a:picLocks noChangeArrowheads="1" noChangeAspect="1"/>
                     </pic:cNvPicPr>
                   </pic:nvPicPr>
                   <pic:blipFill>
-                    <a:blip r:embed="rId39"/>
+                    <a:blip r:embed="rId40"/>
                     <a:stretch>
                       <a:fillRect/>
                     </a:stretch>
@@ -2480,8 +2784,8 @@
         <w:t xml:space="preserve">主要反映进入页缓存和文件系统路径的成本，而不是每次真实落盘延迟。</w:t>
       </w:r>
     </w:p>
-    <w:bookmarkEnd w:id="42"/>
-    <w:bookmarkStart w:id="46" w:name="write-与-o_sync-write"/>
+    <w:bookmarkEnd w:id="43"/>
+    <w:bookmarkStart w:id="47" w:name="write-与-o_sync-write"/>
     <w:p>
       <w:pPr>
         <w:pStyle w:val="Heading3"/>
@@ -2508,18 +2812,18 @@
           <wp:inline>
             <wp:extent cx="5334000" cy="3200400"/>
             <wp:effectExtent b="0" l="0" r="0" t="0"/>
-            <wp:docPr descr="write vs O_SYNC write" title="" id="44" name="Picture"/>
+            <wp:docPr descr="write vs O_SYNC write" title="" id="45" name="Picture"/>
             <a:graphic>
               <a:graphicData uri="http://schemas.openxmlformats.org/drawingml/2006/picture">
                 <pic:pic>
                   <pic:nvPicPr>
-                    <pic:cNvPr descr="figures/partA_write_vs_sync_1MB.png" id="45" name="Picture"/>
+                    <pic:cNvPr descr="figures/partA_write_vs_sync_1MB.png" id="46" name="Picture"/>
                     <pic:cNvPicPr>
                       <a:picLocks noChangeArrowheads="1" noChangeAspect="1"/>
                     </pic:cNvPicPr>
                   </pic:nvPicPr>
                   <pic:blipFill>
-                    <a:blip r:embed="rId43"/>
+                    <a:blip r:embed="rId44"/>
                     <a:stretch>
                       <a:fillRect/>
                     </a:stretch>
@@ -2741,9 +3045,107 @@
         <w:t xml:space="preserve">可以显著减少同步操作次数。</w:t>
       </w:r>
     </w:p>
-    <w:bookmarkEnd w:id="46"/>
+    <w:p>
+      <w:pPr>
+        <w:pStyle w:val="BodyText"/>
+      </w:pPr>
+      <w:r>
+        <w:rPr>
+          <w:rFonts w:hint="eastAsia"/>
+        </w:rPr>
+        <w:t xml:space="preserve">本次实验中</w:t>
+      </w:r>
+      <w:r>
+        <w:t xml:space="preserve"> </w:t>
+      </w:r>
+      <w:r>
+        <w:rPr>
+          <w:rStyle w:val="VerbatimChar"/>
+        </w:rPr>
+        <w:t xml:space="preserve">write_sync</w:t>
+      </w:r>
+      <w:r>
+        <w:t xml:space="preserve"> </w:t>
+      </w:r>
+      <w:r>
+        <w:rPr>
+          <w:rFonts w:hint="eastAsia"/>
+        </w:rPr>
+        <w:t xml:space="preserve">的</w:t>
+      </w:r>
+      <w:r>
+        <w:t xml:space="preserve"> </w:t>
+      </w:r>
+      <w:r>
+        <w:rPr>
+          <w:rStyle w:val="VerbatimChar"/>
+        </w:rPr>
+        <w:t xml:space="preserve">sys_sec</w:t>
+      </w:r>
+      <w:r>
+        <w:t xml:space="preserve"> </w:t>
+      </w:r>
+      <w:r>
+        <w:rPr>
+          <w:rFonts w:hint="eastAsia"/>
+        </w:rPr>
+        <w:t xml:space="preserve">明显小于</w:t>
+      </w:r>
+      <w:r>
+        <w:t xml:space="preserve"> </w:t>
+      </w:r>
+      <w:r>
+        <w:rPr>
+          <w:rStyle w:val="VerbatimChar"/>
+        </w:rPr>
+        <w:t xml:space="preserve">real_sec</w:t>
+      </w:r>
+      <w:r>
+        <w:rPr>
+          <w:rFonts w:hint="eastAsia"/>
+        </w:rPr>
+        <w:t xml:space="preserve">，尤其在小</w:t>
+      </w:r>
+      <w:r>
+        <w:t xml:space="preserve"> BUFFSIZE </w:t>
+      </w:r>
+      <w:r>
+        <w:rPr>
+          <w:rFonts w:hint="eastAsia"/>
+        </w:rPr>
+        <w:t xml:space="preserve">下更明显。这说明进程有大量时间并不是在用户态计算或内核态消耗</w:t>
+      </w:r>
+      <w:r>
+        <w:t xml:space="preserve"> </w:t>
+      </w:r>
+      <w:r>
+        <w:rPr>
+          <w:rFonts w:hint="eastAsia"/>
+        </w:rPr>
+        <w:t xml:space="preserve">CPU，而是在等待同步写路径完成。普通</w:t>
+      </w:r>
+      <w:r>
+        <w:t xml:space="preserve"> </w:t>
+      </w:r>
+      <w:r>
+        <w:rPr>
+          <w:rStyle w:val="VerbatimChar"/>
+        </w:rPr>
+        <w:t xml:space="preserve">write()</w:t>
+      </w:r>
+      <w:r>
+        <w:t xml:space="preserve"> </w:t>
+      </w:r>
+      <w:r>
+        <w:rPr>
+          <w:rFonts w:hint="eastAsia"/>
+        </w:rPr>
+        <w:t xml:space="preserve">则更多体现系统调用和内核页缓存路径开销。</w:t>
+      </w:r>
+    </w:p>
     <w:bookmarkEnd w:id="47"/>
-    <w:bookmarkStart w:id="53" w:name="原理分析与讨论"/>
+    <w:bookmarkEnd w:id="48"/>
+    <w:bookmarkStart w:id="54" w:name="原理分析与讨论"/>
     <w:p>
       <w:pPr>
         <w:pStyle w:val="Heading2"/>
@@ -2758,7 +3160,7 @@
         <w:t xml:space="preserve">原理分析与讨论</w:t>
       </w:r>
     </w:p>
-    <w:bookmarkStart w:id="48" w:name="系统调用次数"/>
+    <w:bookmarkStart w:id="49" w:name="系统调用次数"/>
     <w:p>
       <w:pPr>
         <w:pStyle w:val="Heading3"/>
@@ -2826,8 +3228,8 @@
         <w:t xml:space="preserve">也呈现近似减半趋势。</w:t>
       </w:r>
     </w:p>
-    <w:bookmarkEnd w:id="48"/>
-    <w:bookmarkStart w:id="49" w:name="内核页缓存"/>
+    <w:bookmarkEnd w:id="49"/>
+    <w:bookmarkStart w:id="50" w:name="内核页缓存"/>
     <w:p>
       <w:pPr>
         <w:pStyle w:val="Heading3"/>
@@ -2907,8 +3309,8 @@
         <w:t xml:space="preserve">通常先把数据写入页缓存并标记脏页，随后由内核异步回写。页缓存使得普通写在大缓冲区下看起来非常快，但这并不代表数据已经全部持久化到设备。</w:t>
       </w:r>
     </w:p>
-    <w:bookmarkEnd w:id="49"/>
-    <w:bookmarkStart w:id="50" w:name="用户态缓冲"/>
+    <w:bookmarkEnd w:id="50"/>
+    <w:bookmarkStart w:id="51" w:name="用户态缓冲"/>
     <w:p>
       <w:pPr>
         <w:pStyle w:val="Heading3"/>
@@ -3012,8 +3414,8 @@
         <w:t xml:space="preserve">。</w:t>
       </w:r>
     </w:p>
-    <w:bookmarkEnd w:id="50"/>
-    <w:bookmarkStart w:id="51" w:name="o_sync"/>
+    <w:bookmarkEnd w:id="51"/>
+    <w:bookmarkStart w:id="52" w:name="o_sync"/>
     <w:p>
       <w:pPr>
         <w:pStyle w:val="Heading3"/>
@@ -3099,8 +3501,8 @@
         <w:t xml:space="preserve">，正说明同步写的主导成本在内核和存储路径，而非用户态循环。</w:t>
       </w:r>
     </w:p>
-    <w:bookmarkEnd w:id="51"/>
-    <w:bookmarkStart w:id="52" w:name="buffsize-的收益递减"/>
+    <w:bookmarkEnd w:id="52"/>
+    <w:bookmarkStart w:id="53" w:name="buffsize-的收益递减"/>
     <w:p>
       <w:pPr>
         <w:pStyle w:val="Heading3"/>
@@ -3162,9 +3564,9 @@
         <w:t xml:space="preserve">后并不一定更快，甚至可能变慢。这是因为系统调用次数已经足够少，新的瓶颈转移到页缓存、内存带宽、文件系统路径、缓存局部性以及大块内存分配/拷贝等因素。</w:t>
       </w:r>
     </w:p>
-    <w:bookmarkEnd w:id="52"/>
     <w:bookmarkEnd w:id="53"/>
-    <w:bookmarkStart w:id="54" w:name="结论"/>
+    <w:bookmarkEnd w:id="54"/>
+    <w:bookmarkStart w:id="55" w:name="结论"/>
     <w:p>
       <w:pPr>
         <w:pStyle w:val="Heading2"/>
@@ -3404,8 +3806,8 @@
         <w:t xml:space="preserve">级别后通常进入收益递减区间。</w:t>
       </w:r>
     </w:p>
-    <w:bookmarkEnd w:id="54"/>
-    <w:bookmarkStart w:id="59" w:name="附录-a关键实验数据"/>
+    <w:bookmarkEnd w:id="55"/>
+    <w:bookmarkStart w:id="60" w:name="附录-a关键实验数据"/>
     <w:p>
       <w:pPr>
         <w:pStyle w:val="Heading2"/>
@@ -3426,7 +3828,7 @@
         <w:t xml:space="preserve">A：关键实验数据</w:t>
       </w:r>
     </w:p>
-    <w:bookmarkStart w:id="55" w:name="a.1-读实验完整数据"/>
+    <w:bookmarkStart w:id="56" w:name="a.1-读实验完整数据"/>
     <w:p>
       <w:pPr>
         <w:pStyle w:val="Heading3"/>
@@ -7335,8 +7737,8 @@
         </w:tc>
       </w:tr>
     </w:tbl>
-    <w:bookmarkEnd w:id="55"/>
-    <w:bookmarkStart w:id="56" w:name="a.2-500-mb-普通-write-数据"/>
+    <w:bookmarkEnd w:id="56"/>
+    <w:bookmarkStart w:id="57" w:name="a.2-500-mb-普通-write-数据"/>
     <w:p>
       <w:pPr>
         <w:pStyle w:val="Heading3"/>
@@ -8670,8 +9072,8 @@
         </w:tc>
       </w:tr>
     </w:tbl>
-    <w:bookmarkEnd w:id="56"/>
-    <w:bookmarkStart w:id="57" w:name="a.3-1-mb-普通-write-数据"/>
+    <w:bookmarkEnd w:id="57"/>
+    <w:bookmarkStart w:id="58" w:name="a.3-1-mb-普通-write-数据"/>
     <w:p>
       <w:pPr>
         <w:pStyle w:val="Heading3"/>
@@ -10005,8 +10407,8 @@
         </w:tc>
       </w:tr>
     </w:tbl>
-    <w:bookmarkEnd w:id="57"/>
-    <w:bookmarkStart w:id="58" w:name="a.4-1-mb-o_sync-write-数据"/>
+    <w:bookmarkEnd w:id="58"/>
+    <w:bookmarkStart w:id="59" w:name="a.4-1-mb-o_sync-write-数据"/>
     <w:p>
       <w:pPr>
         <w:pStyle w:val="Heading3"/>
@@ -11331,9 +11733,9 @@
         </w:tc>
       </w:tr>
     </w:tbl>
-    <w:bookmarkEnd w:id="58"/>
     <w:bookmarkEnd w:id="59"/>
     <w:bookmarkEnd w:id="60"/>
+    <w:bookmarkEnd w:id="61"/>
     <w:sectPr>
       <w:footnotePr>
         <w:numRestart w:val="eachSect"/>

</xml_diff>